<commit_message>
Add explicit repository link to final paper
</commit_message>
<xml_diff>
--- a/reports/final_report.docx
+++ b/reports/final_report.docx
@@ -10164,6 +10164,41 @@
           <w:sz w:val="24"/>
         </w:rPr>
         <w:t>代码采用 scripts/、src/uav_project/、configs/、docs/、reports/ 分层结构。脚本按数据导入、网页采集、清洗、特征提取、传统训练、Qwen训练、全局冻结、留出评估和结果导出的顺序执行。随机种子为 42。训练与推理环境、模型版本、代码哈希、数据清单哈希和训练回执均已保存。</w:t>
+      </w:r>
+    </w:p>
+    <w:p>
+      <w:pPr>
+        <w:spacing w:before="0" w:after="120" w:line="360" w:lineRule="auto"/>
+        <w:ind w:firstLine="420"/>
+      </w:pPr>
+      <w:r>
+        <w:rPr>
+          <w:rFonts w:ascii="Times New Roman" w:hAnsi="Times New Roman" w:eastAsia="宋体" w:cs="Times New Roman"/>
+          <w:b w:val="0"/>
+          <w:color w:val="000000"/>
+          <w:sz w:val="24"/>
+        </w:rPr>
+        <w:t>项目代码仓库：</w:t>
+      </w:r>
+      <w:hyperlink r:id="rId15">
+        <w:r>
+          <w:rPr>
+            <w:rFonts w:ascii="Times New Roman" w:hAnsi="Times New Roman" w:eastAsia="宋体" w:cs="Times New Roman"/>
+            <w:sz w:val="24"/>
+            <w:color w:val="0563C1"/>
+            <w:u w:val="single"/>
+          </w:rPr>
+          <w:t>https://github.com/fangdawei33/uav-type-classification-course-project</w:t>
+        </w:r>
+      </w:hyperlink>
+      <w:r>
+        <w:rPr>
+          <w:rFonts w:ascii="Times New Roman" w:hAnsi="Times New Roman" w:eastAsia="宋体" w:cs="Times New Roman"/>
+          <w:b w:val="0"/>
+          <w:color w:val="000000"/>
+          <w:sz w:val="24"/>
+        </w:rPr>
+        <w:t>。</w:t>
       </w:r>
     </w:p>
     <w:p>

</xml_diff>